<commit_message>
style(report): padronizar tipografia para Arial 12, alinhamento justificado e espacamento 1.5
</commit_message>
<xml_diff>
--- a/outputs/relatorios/relatorio_tecnico_processo_2026_3611213.docx
+++ b/outputs/relatorios/relatorio_tecnico_processo_2026_3611213.docx
@@ -13,7 +13,7 @@
       <w:r/>
       <w:r>
         <w:rPr>
-          <w:rFonts w:ascii="Times New Roman" w:hAnsi="Times New Roman"/>
+          <w:rFonts w:ascii="Arial" w:hAnsi="Arial"/>
           <w:b/>
           <w:sz w:val="28"/>
         </w:rPr>
@@ -31,9 +31,9 @@
       <w:r/>
       <w:r>
         <w:rPr>
-          <w:rFonts w:ascii="Times New Roman" w:hAnsi="Times New Roman"/>
+          <w:rFonts w:ascii="Arial" w:hAnsi="Arial"/>
           <w:b/>
-          <w:sz w:val="22"/>
+          <w:sz w:val="24"/>
         </w:rPr>
         <w:t>Relatório Técnico de Diagnóstico Geoespacial de Desmatamento e Mapeamento de Áreas para Unidades Demonstrativas de Restauração Florestal no Parque Estadual Charapucu</w:t>
       </w:r>
@@ -49,16 +49,16 @@
       <w:r/>
       <w:r>
         <w:rPr>
-          <w:rFonts w:ascii="Times New Roman" w:hAnsi="Times New Roman"/>
+          <w:rFonts w:ascii="Arial" w:hAnsi="Arial"/>
           <w:b/>
-          <w:sz w:val="22"/>
+          <w:sz w:val="24"/>
         </w:rPr>
         <w:t>1. Identificação do Documento</w:t>
       </w:r>
     </w:p>
     <w:p>
       <w:pPr>
-        <w:spacing w:after="40" w:line="276" w:lineRule="auto"/>
+        <w:spacing w:after="60" w:line="276" w:lineRule="auto"/>
         <w:jc w:val="left"/>
         <w:rPr>
           <w:rFonts w:ascii="Arial" w:hAnsi="Arial" w:cs="Arial"/>
@@ -67,16 +67,16 @@
       <w:r/>
       <w:r>
         <w:rPr>
-          <w:rFonts w:ascii="Times New Roman" w:hAnsi="Times New Roman"/>
+          <w:rFonts w:ascii="Arial" w:hAnsi="Arial"/>
           <w:b w:val="0"/>
-          <w:sz w:val="22"/>
+          <w:sz w:val="24"/>
         </w:rPr>
         <w:t>Nº do Protocolo: Processo nº 2026/3611213 (Memorando nº 04/ASSTEC e Despacho DGMUC)</w:t>
       </w:r>
     </w:p>
     <w:p>
       <w:pPr>
-        <w:spacing w:after="40" w:line="276" w:lineRule="auto"/>
+        <w:spacing w:after="60" w:line="276" w:lineRule="auto"/>
         <w:jc w:val="left"/>
         <w:rPr>
           <w:rFonts w:ascii="Arial" w:hAnsi="Arial" w:cs="Arial"/>
@@ -85,16 +85,16 @@
       <w:r/>
       <w:r>
         <w:rPr>
-          <w:rFonts w:ascii="Times New Roman" w:hAnsi="Times New Roman"/>
+          <w:rFonts w:ascii="Arial" w:hAnsi="Arial"/>
           <w:b w:val="0"/>
-          <w:sz w:val="22"/>
+          <w:sz w:val="24"/>
         </w:rPr>
         <w:t>Elaboração: Samuel da Costa dos Santos – Coordenador do Núcleo de Geotecnologias (NGEO/IDEFLOR-Bio)</w:t>
       </w:r>
     </w:p>
     <w:p>
       <w:pPr>
-        <w:spacing w:after="40" w:line="276" w:lineRule="auto"/>
+        <w:spacing w:after="60" w:line="276" w:lineRule="auto"/>
         <w:jc w:val="left"/>
         <w:rPr>
           <w:rFonts w:ascii="Arial" w:hAnsi="Arial" w:cs="Arial"/>
@@ -103,16 +103,16 @@
       <w:r/>
       <w:r>
         <w:rPr>
-          <w:rFonts w:ascii="Times New Roman" w:hAnsi="Times New Roman"/>
+          <w:rFonts w:ascii="Arial" w:hAnsi="Arial"/>
           <w:b w:val="0"/>
-          <w:sz w:val="22"/>
+          <w:sz w:val="24"/>
         </w:rPr>
         <w:t>Demandante: Diretoria de Gestão e Monitoramento de Unidades de Conservação (DGMUC) / ASSTEC</w:t>
       </w:r>
     </w:p>
     <w:p>
       <w:pPr>
-        <w:spacing w:after="200" w:line="276" w:lineRule="auto"/>
+        <w:spacing w:after="240" w:line="276" w:lineRule="auto"/>
         <w:jc w:val="left"/>
         <w:rPr>
           <w:rFonts w:ascii="Arial" w:hAnsi="Arial" w:cs="Arial"/>
@@ -121,16 +121,16 @@
       <w:r/>
       <w:r>
         <w:rPr>
-          <w:rFonts w:ascii="Times New Roman" w:hAnsi="Times New Roman"/>
+          <w:rFonts w:ascii="Arial" w:hAnsi="Arial"/>
           <w:b w:val="0"/>
-          <w:sz w:val="22"/>
+          <w:sz w:val="24"/>
         </w:rPr>
         <w:t>Data: 29 de Outubro de 2026</w:t>
       </w:r>
     </w:p>
     <w:p>
       <w:pPr>
-        <w:spacing w:before="240" w:after="80" w:line="276" w:lineRule="auto"/>
+        <w:spacing w:before="240" w:after="120" w:line="276" w:lineRule="auto"/>
         <w:jc w:val="left"/>
         <w:rPr>
           <w:rFonts w:ascii="Arial" w:hAnsi="Arial" w:cs="Arial"/>
@@ -139,18 +139,18 @@
       <w:r/>
       <w:r>
         <w:rPr>
-          <w:rFonts w:ascii="Times New Roman" w:hAnsi="Times New Roman"/>
+          <w:rFonts w:ascii="Arial" w:hAnsi="Arial"/>
           <w:b/>
-          <w:sz w:val="22"/>
+          <w:sz w:val="24"/>
         </w:rPr>
         <w:t>2. Objetivos</w:t>
       </w:r>
     </w:p>
     <w:p>
       <w:pPr>
-        <w:spacing w:after="200" w:line="276" w:lineRule="auto"/>
+        <w:spacing w:after="200" w:line="360" w:lineRule="auto"/>
         <w:ind w:firstLine="360"/>
-        <w:jc w:val="left"/>
+        <w:jc w:val="both"/>
         <w:rPr>
           <w:rFonts w:ascii="Arial" w:hAnsi="Arial" w:cs="Arial"/>
         </w:rPr>
@@ -158,16 +158,16 @@
       <w:r/>
       <w:r>
         <w:rPr>
-          <w:rFonts w:ascii="Times New Roman" w:hAnsi="Times New Roman"/>
+          <w:rFonts w:ascii="Arial" w:hAnsi="Arial"/>
           <w:b w:val="0"/>
-          <w:sz w:val="22"/>
+          <w:sz w:val="24"/>
         </w:rPr>
         <w:t>O presente relatório técnico tem por finalidade apresentar o levantamento geoespacial e a prancha cartográfica oficial elaborados pelo Núcleo de Geotecnologias (NGEO/IDEFLOR-Bio) em atendimento aos autos do Processo nº 2026/3611213. O objetivo central é a identificação, qualificação e delimitação espacial de polígonos representativos de supressão antrópica e desmatamento no interior do Parque Estadual Charapucu, atendendo à demanda de seleção de áreas que totalizem, no mínimo, 130 hectares distribuídos no menor número possível de polígonos contíguos, com vistas a subsidiar a implantação de Unidades Demonstrativas de Restauração Florestal em consonância com as diretrizes do Plano de Recuperação da Vegetação Nativa do Estado do Pará (PRVN-PA).</w:t>
       </w:r>
     </w:p>
     <w:p>
       <w:pPr>
-        <w:spacing w:before="240" w:after="80" w:line="276" w:lineRule="auto"/>
+        <w:spacing w:before="240" w:after="120" w:line="276" w:lineRule="auto"/>
         <w:jc w:val="left"/>
         <w:rPr>
           <w:rFonts w:ascii="Arial" w:hAnsi="Arial" w:cs="Arial"/>
@@ -176,18 +176,18 @@
       <w:r/>
       <w:r>
         <w:rPr>
-          <w:rFonts w:ascii="Times New Roman" w:hAnsi="Times New Roman"/>
+          <w:rFonts w:ascii="Arial" w:hAnsi="Arial"/>
           <w:b/>
-          <w:sz w:val="22"/>
+          <w:sz w:val="24"/>
         </w:rPr>
         <w:t>3. Contextualização</w:t>
       </w:r>
     </w:p>
     <w:p>
       <w:pPr>
-        <w:spacing w:after="200" w:line="276" w:lineRule="auto"/>
+        <w:spacing w:after="200" w:line="360" w:lineRule="auto"/>
         <w:ind w:firstLine="360"/>
-        <w:jc w:val="left"/>
+        <w:jc w:val="both"/>
         <w:rPr>
           <w:rFonts w:ascii="Arial" w:hAnsi="Arial" w:cs="Arial"/>
         </w:rPr>
@@ -195,16 +195,16 @@
       <w:r/>
       <w:r>
         <w:rPr>
-          <w:rFonts w:ascii="Times New Roman" w:hAnsi="Times New Roman"/>
+          <w:rFonts w:ascii="Arial" w:hAnsi="Arial"/>
           <w:b w:val="0"/>
-          <w:sz w:val="22"/>
+          <w:sz w:val="24"/>
         </w:rPr>
         <w:t>Por intermédio do Memorando nº 04/ASSTEC (Doc. Sequencial 01), subscrito pelo assessor Dilson Lopes, e corroborado pelo Despacho exarado pelo Diretor Ellivelton de Carvalho da Cunha (Doc. Sequencial 02), a Diretoria de Gestão e Monitoramento de Unidades de Conservação (DGMUC) encaminhou solicitação de apoio técnico ao NGEO para subsidiar projeto de restauração florestal no Parque Estadual Charapucu. Criado pelo Decreto Estadual nº 2.592, de 09 de novembro de 2010, no município de Afuá (Arquipélago do Marajó), o Parque Estadual Charapucu constitui uma Unidade de Conservação de Proteção Integral circunscrita por ecossistemas de várzea estuarina. Em face da dinâmica peculiar de marés e da elevada taxa de regeneração biológica da região, o diagnóstico espacial exigiu a diferenciação rigorosa entre feições sedimentares temporárias e áreas de efetiva alteração antrópica, fornecendo uma base auditada e segura para aplicação dos critérios técnicos do PRVN-PA.</w:t>
       </w:r>
     </w:p>
     <w:p>
       <w:pPr>
-        <w:spacing w:before="240" w:after="80" w:line="276" w:lineRule="auto"/>
+        <w:spacing w:before="240" w:after="120" w:line="276" w:lineRule="auto"/>
         <w:jc w:val="left"/>
         <w:rPr>
           <w:rFonts w:ascii="Arial" w:hAnsi="Arial" w:cs="Arial"/>
@@ -213,18 +213,18 @@
       <w:r/>
       <w:r>
         <w:rPr>
-          <w:rFonts w:ascii="Times New Roman" w:hAnsi="Times New Roman"/>
+          <w:rFonts w:ascii="Arial" w:hAnsi="Arial"/>
           <w:b/>
-          <w:sz w:val="22"/>
+          <w:sz w:val="24"/>
         </w:rPr>
         <w:t>4. Procedimentos Realizados</w:t>
       </w:r>
     </w:p>
     <w:p>
       <w:pPr>
-        <w:spacing w:after="200" w:line="276" w:lineRule="auto"/>
+        <w:spacing w:after="200" w:line="360" w:lineRule="auto"/>
         <w:ind w:firstLine="360"/>
-        <w:jc w:val="left"/>
+        <w:jc w:val="both"/>
         <w:rPr>
           <w:rFonts w:ascii="Arial" w:hAnsi="Arial" w:cs="Arial"/>
         </w:rPr>
@@ -232,16 +232,16 @@
       <w:r/>
       <w:r>
         <w:rPr>
-          <w:rFonts w:ascii="Times New Roman" w:hAnsi="Times New Roman"/>
+          <w:rFonts w:ascii="Arial" w:hAnsi="Arial"/>
           <w:b w:val="0"/>
-          <w:sz w:val="22"/>
+          <w:sz w:val="24"/>
         </w:rPr>
         <w:t>A análise foi realizada em ambiente de Sistema de Informações Geográficas (SIG) sob o Sistema Geodésico de Referência SIRGAS 2000, com projeção plana UTM Fuso 22N (EPSG:31988) para todos os cálculos métricos de área e distância euclidiana. Os procedimentos envolveram: a) importação do limite oficial do PES Charapucu homologado no acervo do IDEFLOR-Bio; b) consulta e extração dos dados históricos do Sistema de Detecção do Desmatamento em Tempo Real (DETER / INPE / TerraBrasilis), identificando alertas oficiais de corte raso (DESMATAMENTO_CR); c) eliminação topológica de cursos d'água, furos e áreas sob interferência direta de maré; d) validação do estágio sucessional secundário da cobertura vegetal por meio do mosaico Sentinel-2 Cloudless EOX (10 m); e e) geração de prancha cartográfica institucional padronizada (A4 Paisagem, 300 DPI e PDF vetorial) conforme as normas técnicas do QGIS/NGEO.</w:t>
       </w:r>
     </w:p>
     <w:p>
       <w:pPr>
-        <w:spacing w:before="240" w:after="80" w:line="276" w:lineRule="auto"/>
+        <w:spacing w:before="240" w:after="120" w:line="276" w:lineRule="auto"/>
         <w:jc w:val="left"/>
         <w:rPr>
           <w:rFonts w:ascii="Arial" w:hAnsi="Arial" w:cs="Arial"/>
@@ -250,17 +250,17 @@
       <w:r/>
       <w:r>
         <w:rPr>
-          <w:rFonts w:ascii="Times New Roman" w:hAnsi="Times New Roman"/>
+          <w:rFonts w:ascii="Arial" w:hAnsi="Arial"/>
           <w:b/>
-          <w:sz w:val="22"/>
+          <w:sz w:val="24"/>
         </w:rPr>
         <w:t>5. Resultados</w:t>
       </w:r>
     </w:p>
     <w:p>
       <w:pPr>
-        <w:spacing w:after="120" w:line="276" w:lineRule="auto"/>
-        <w:jc w:val="left"/>
+        <w:spacing w:after="160" w:line="360" w:lineRule="auto"/>
+        <w:jc w:val="both"/>
         <w:rPr>
           <w:rFonts w:ascii="Arial" w:hAnsi="Arial" w:cs="Arial"/>
         </w:rPr>
@@ -268,16 +268,16 @@
       <w:r/>
       <w:r>
         <w:rPr>
-          <w:rFonts w:ascii="Times New Roman" w:hAnsi="Times New Roman"/>
+          <w:rFonts w:ascii="Arial" w:hAnsi="Arial"/>
           <w:b w:val="0"/>
-          <w:sz w:val="22"/>
+          <w:sz w:val="24"/>
         </w:rPr>
         <w:t>A auditoria geoespacial identificou que a área oficial de corte raso no PES Charapucu está concentrada no Setor Centro-Leste (bacia da Baía de Vieira Grande), decorrente de evento detectado em 20/07/2019. A área é formada por dois polígonos contíguos que totalizam 183,76 hectares, atendendo plenamente à exigência de menor fragmentação possível e superando a meta contratual mínima de 130 hectares em 141,35% (+53,76 ha de superávit).</w:t>
       </w:r>
     </w:p>
     <w:p>
       <w:pPr>
-        <w:spacing w:before="240" w:after="80" w:line="276" w:lineRule="auto"/>
+        <w:spacing w:before="240" w:after="120" w:line="276" w:lineRule="auto"/>
         <w:jc w:val="left"/>
         <w:rPr>
           <w:rFonts w:ascii="Arial" w:hAnsi="Arial" w:cs="Arial"/>
@@ -286,17 +286,17 @@
       <w:r/>
       <w:r>
         <w:rPr>
-          <w:rFonts w:ascii="Times New Roman" w:hAnsi="Times New Roman"/>
+          <w:rFonts w:ascii="Arial" w:hAnsi="Arial"/>
           <w:b/>
-          <w:sz w:val="22"/>
+          <w:sz w:val="24"/>
         </w:rPr>
         <w:t>5.1 Detalhamento das Glebas Auditadas para Unidades Demonstrativas</w:t>
       </w:r>
     </w:p>
     <w:p>
       <w:pPr>
-        <w:spacing w:after="120" w:line="276" w:lineRule="auto"/>
-        <w:jc w:val="left"/>
+        <w:spacing w:after="120" w:line="360" w:lineRule="auto"/>
+        <w:jc w:val="both"/>
         <w:rPr>
           <w:rFonts w:ascii="Arial" w:hAnsi="Arial" w:cs="Arial"/>
         </w:rPr>
@@ -304,9 +304,9 @@
       <w:r/>
       <w:r>
         <w:rPr>
-          <w:rFonts w:ascii="Times New Roman" w:hAnsi="Times New Roman"/>
+          <w:rFonts w:ascii="Arial" w:hAnsi="Arial"/>
           <w:b w:val="0"/>
-          <w:sz w:val="22"/>
+          <w:sz w:val="24"/>
         </w:rPr>
         <w:t>As glebas selecionadas para compor a carteira de áreas prioritárias para restauração florestal são descritas a seguir:</w:t>
       </w:r>
@@ -338,9 +338,9 @@
             <w:r/>
             <w:r>
               <w:rPr>
-                <w:rFonts w:ascii="Times New Roman" w:hAnsi="Times New Roman"/>
+                <w:rFonts w:ascii="Arial" w:hAnsi="Arial"/>
                 <w:b/>
-                <w:sz w:val="19"/>
+                <w:sz w:val="20"/>
               </w:rPr>
               <w:t>Identificador da Gleba</w:t>
             </w:r>
@@ -361,9 +361,9 @@
             <w:r/>
             <w:r>
               <w:rPr>
-                <w:rFonts w:ascii="Times New Roman" w:hAnsi="Times New Roman"/>
+                <w:rFonts w:ascii="Arial" w:hAnsi="Arial"/>
                 <w:b/>
-                <w:sz w:val="19"/>
+                <w:sz w:val="20"/>
               </w:rPr>
               <w:t>Área Auditada (ha)</w:t>
             </w:r>
@@ -384,9 +384,9 @@
             <w:r/>
             <w:r>
               <w:rPr>
-                <w:rFonts w:ascii="Times New Roman" w:hAnsi="Times New Roman"/>
+                <w:rFonts w:ascii="Arial" w:hAnsi="Arial"/>
                 <w:b/>
-                <w:sz w:val="19"/>
+                <w:sz w:val="20"/>
               </w:rPr>
               <w:t>Localização &amp; Acessibilidade Fluvial</w:t>
             </w:r>
@@ -409,9 +409,9 @@
             <w:r/>
             <w:r>
               <w:rPr>
-                <w:rFonts w:ascii="Times New Roman" w:hAnsi="Times New Roman"/>
+                <w:rFonts w:ascii="Arial" w:hAnsi="Arial"/>
                 <w:b w:val="0"/>
-                <w:sz w:val="18"/>
+                <w:sz w:val="19"/>
               </w:rPr>
               <w:t>GLEBA-DETER-01 (ID INPE: 52664_hist)</w:t>
             </w:r>
@@ -432,9 +432,9 @@
             <w:r/>
             <w:r>
               <w:rPr>
-                <w:rFonts w:ascii="Times New Roman" w:hAnsi="Times New Roman"/>
+                <w:rFonts w:ascii="Arial" w:hAnsi="Arial"/>
                 <w:b w:val="0"/>
-                <w:sz w:val="18"/>
+                <w:sz w:val="19"/>
               </w:rPr>
               <w:t>173,28 ha</w:t>
             </w:r>
@@ -455,9 +455,9 @@
             <w:r/>
             <w:r>
               <w:rPr>
-                <w:rFonts w:ascii="Times New Roman" w:hAnsi="Times New Roman"/>
+                <w:rFonts w:ascii="Arial" w:hAnsi="Arial"/>
                 <w:b w:val="0"/>
-                <w:sz w:val="18"/>
+                <w:sz w:val="19"/>
               </w:rPr>
               <w:t>Setor Leste / Baía de Vieira Grande (2.298 m da calha)</w:t>
             </w:r>
@@ -480,9 +480,9 @@
             <w:r/>
             <w:r>
               <w:rPr>
-                <w:rFonts w:ascii="Times New Roman" w:hAnsi="Times New Roman"/>
+                <w:rFonts w:ascii="Arial" w:hAnsi="Arial"/>
                 <w:b w:val="0"/>
-                <w:sz w:val="18"/>
+                <w:sz w:val="19"/>
               </w:rPr>
               <w:t>GLEBA-DETER-02 (ID INPE: 52663_hist)</w:t>
             </w:r>
@@ -503,9 +503,9 @@
             <w:r/>
             <w:r>
               <w:rPr>
-                <w:rFonts w:ascii="Times New Roman" w:hAnsi="Times New Roman"/>
+                <w:rFonts w:ascii="Arial" w:hAnsi="Arial"/>
                 <w:b w:val="0"/>
-                <w:sz w:val="18"/>
+                <w:sz w:val="19"/>
               </w:rPr>
               <w:t>10,48 ha</w:t>
             </w:r>
@@ -526,9 +526,9 @@
             <w:r/>
             <w:r>
               <w:rPr>
-                <w:rFonts w:ascii="Times New Roman" w:hAnsi="Times New Roman"/>
+                <w:rFonts w:ascii="Arial" w:hAnsi="Arial"/>
                 <w:b w:val="0"/>
-                <w:sz w:val="18"/>
+                <w:sz w:val="19"/>
               </w:rPr>
               <w:t>Setor Leste / Baía de Vieira Grande (3.214 m da calha)</w:t>
             </w:r>
@@ -538,7 +538,7 @@
     </w:tbl>
     <w:p>
       <w:pPr>
-        <w:spacing w:before="240" w:after="80" w:line="276" w:lineRule="auto"/>
+        <w:spacing w:before="240" w:after="120" w:line="276" w:lineRule="auto"/>
         <w:jc w:val="left"/>
         <w:rPr>
           <w:rFonts w:ascii="Arial" w:hAnsi="Arial" w:cs="Arial"/>
@@ -547,9 +547,9 @@
       <w:r/>
       <w:r>
         <w:rPr>
-          <w:rFonts w:ascii="Times New Roman" w:hAnsi="Times New Roman"/>
+          <w:rFonts w:ascii="Arial" w:hAnsi="Arial"/>
           <w:b/>
-          <w:sz w:val="22"/>
+          <w:sz w:val="24"/>
         </w:rPr>
         <w:t>5.2 Enquadramento Geral e Critérios do PRVN-PA</w:t>
       </w:r>
@@ -580,9 +580,9 @@
             <w:r/>
             <w:r>
               <w:rPr>
-                <w:rFonts w:ascii="Times New Roman" w:hAnsi="Times New Roman"/>
+                <w:rFonts w:ascii="Arial" w:hAnsi="Arial"/>
                 <w:b/>
-                <w:sz w:val="19"/>
+                <w:sz w:val="20"/>
               </w:rPr>
               <w:t>Parâmetro do Projeto / Demanda</w:t>
             </w:r>
@@ -603,9 +603,9 @@
             <w:r/>
             <w:r>
               <w:rPr>
-                <w:rFonts w:ascii="Times New Roman" w:hAnsi="Times New Roman"/>
+                <w:rFonts w:ascii="Arial" w:hAnsi="Arial"/>
                 <w:b/>
-                <w:sz w:val="19"/>
+                <w:sz w:val="20"/>
               </w:rPr>
               <w:t>Especificação Auditada (Processo nº 2026/3611213)</w:t>
             </w:r>
@@ -628,9 +628,9 @@
             <w:r/>
             <w:r>
               <w:rPr>
-                <w:rFonts w:ascii="Times New Roman" w:hAnsi="Times New Roman"/>
+                <w:rFonts w:ascii="Arial" w:hAnsi="Arial"/>
                 <w:b/>
-                <w:sz w:val="18"/>
+                <w:sz w:val="19"/>
               </w:rPr>
               <w:t>Unidade de Conservação</w:t>
             </w:r>
@@ -651,9 +651,9 @@
             <w:r/>
             <w:r>
               <w:rPr>
-                <w:rFonts w:ascii="Times New Roman" w:hAnsi="Times New Roman"/>
+                <w:rFonts w:ascii="Arial" w:hAnsi="Arial"/>
                 <w:b w:val="0"/>
-                <w:sz w:val="18"/>
+                <w:sz w:val="19"/>
               </w:rPr>
               <w:t>Parque Estadual Charapucu (PES Charapucu)</w:t>
             </w:r>
@@ -676,9 +676,9 @@
             <w:r/>
             <w:r>
               <w:rPr>
-                <w:rFonts w:ascii="Times New Roman" w:hAnsi="Times New Roman"/>
+                <w:rFonts w:ascii="Arial" w:hAnsi="Arial"/>
                 <w:b/>
-                <w:sz w:val="18"/>
+                <w:sz w:val="19"/>
               </w:rPr>
               <w:t>Ato Legal de Criação</w:t>
             </w:r>
@@ -699,9 +699,9 @@
             <w:r/>
             <w:r>
               <w:rPr>
-                <w:rFonts w:ascii="Times New Roman" w:hAnsi="Times New Roman"/>
+                <w:rFonts w:ascii="Arial" w:hAnsi="Arial"/>
                 <w:b w:val="0"/>
-                <w:sz w:val="18"/>
+                <w:sz w:val="19"/>
               </w:rPr>
               <w:t>Decreto Estadual nº 2.592, de 09 de novembro de 2010</w:t>
             </w:r>
@@ -724,9 +724,9 @@
             <w:r/>
             <w:r>
               <w:rPr>
-                <w:rFonts w:ascii="Times New Roman" w:hAnsi="Times New Roman"/>
+                <w:rFonts w:ascii="Arial" w:hAnsi="Arial"/>
                 <w:b/>
-                <w:sz w:val="18"/>
+                <w:sz w:val="19"/>
               </w:rPr>
               <w:t>Categoria de Manejo</w:t>
             </w:r>
@@ -747,9 +747,9 @@
             <w:r/>
             <w:r>
               <w:rPr>
-                <w:rFonts w:ascii="Times New Roman" w:hAnsi="Times New Roman"/>
+                <w:rFonts w:ascii="Arial" w:hAnsi="Arial"/>
                 <w:b w:val="0"/>
-                <w:sz w:val="18"/>
+                <w:sz w:val="19"/>
               </w:rPr>
               <w:t>Proteção Integral (SNUC / Lei nº 9.985/2000; SEUC / Lei nº 5.977/1996)</w:t>
             </w:r>
@@ -772,9 +772,9 @@
             <w:r/>
             <w:r>
               <w:rPr>
-                <w:rFonts w:ascii="Times New Roman" w:hAnsi="Times New Roman"/>
+                <w:rFonts w:ascii="Arial" w:hAnsi="Arial"/>
                 <w:b/>
-                <w:sz w:val="18"/>
+                <w:sz w:val="19"/>
               </w:rPr>
               <w:t>Município / Região de Integração</w:t>
             </w:r>
@@ -795,9 +795,9 @@
             <w:r/>
             <w:r>
               <w:rPr>
-                <w:rFonts w:ascii="Times New Roman" w:hAnsi="Times New Roman"/>
+                <w:rFonts w:ascii="Arial" w:hAnsi="Arial"/>
                 <w:b w:val="0"/>
-                <w:sz w:val="18"/>
+                <w:sz w:val="19"/>
               </w:rPr>
               <w:t>Afuá / Região de Integração do Marajó</w:t>
             </w:r>
@@ -820,9 +820,9 @@
             <w:r/>
             <w:r>
               <w:rPr>
-                <w:rFonts w:ascii="Times New Roman" w:hAnsi="Times New Roman"/>
+                <w:rFonts w:ascii="Arial" w:hAnsi="Arial"/>
                 <w:b/>
-                <w:sz w:val="18"/>
+                <w:sz w:val="19"/>
               </w:rPr>
               <w:t>Finalidade Institucional</w:t>
             </w:r>
@@ -843,9 +843,9 @@
             <w:r/>
             <w:r>
               <w:rPr>
-                <w:rFonts w:ascii="Times New Roman" w:hAnsi="Times New Roman"/>
+                <w:rFonts w:ascii="Arial" w:hAnsi="Arial"/>
                 <w:b w:val="0"/>
-                <w:sz w:val="18"/>
+                <w:sz w:val="19"/>
               </w:rPr>
               <w:t>Unidades Demonstrativas de Restauração Florestal (PRVN-PA)</w:t>
             </w:r>
@@ -868,9 +868,9 @@
             <w:r/>
             <w:r>
               <w:rPr>
-                <w:rFonts w:ascii="Times New Roman" w:hAnsi="Times New Roman"/>
+                <w:rFonts w:ascii="Arial" w:hAnsi="Arial"/>
                 <w:b/>
-                <w:sz w:val="18"/>
+                <w:sz w:val="19"/>
               </w:rPr>
               <w:t>Meta Contratual Mínima</w:t>
             </w:r>
@@ -891,9 +891,9 @@
             <w:r/>
             <w:r>
               <w:rPr>
-                <w:rFonts w:ascii="Times New Roman" w:hAnsi="Times New Roman"/>
+                <w:rFonts w:ascii="Arial" w:hAnsi="Arial"/>
                 <w:b w:val="0"/>
-                <w:sz w:val="18"/>
+                <w:sz w:val="19"/>
               </w:rPr>
               <w:t>130,00 hectares</w:t>
             </w:r>
@@ -916,9 +916,9 @@
             <w:r/>
             <w:r>
               <w:rPr>
-                <w:rFonts w:ascii="Times New Roman" w:hAnsi="Times New Roman"/>
+                <w:rFonts w:ascii="Arial" w:hAnsi="Arial"/>
                 <w:b/>
-                <w:sz w:val="18"/>
+                <w:sz w:val="19"/>
               </w:rPr>
               <w:t>Área Total Mapeada e Auditada</w:t>
             </w:r>
@@ -939,9 +939,9 @@
             <w:r/>
             <w:r>
               <w:rPr>
-                <w:rFonts w:ascii="Times New Roman" w:hAnsi="Times New Roman"/>
+                <w:rFonts w:ascii="Arial" w:hAnsi="Arial"/>
                 <w:b w:val="0"/>
-                <w:sz w:val="18"/>
+                <w:sz w:val="19"/>
               </w:rPr>
               <w:t>183,76 hectares</w:t>
             </w:r>
@@ -964,9 +964,9 @@
             <w:r/>
             <w:r>
               <w:rPr>
-                <w:rFonts w:ascii="Times New Roman" w:hAnsi="Times New Roman"/>
+                <w:rFonts w:ascii="Arial" w:hAnsi="Arial"/>
                 <w:b/>
-                <w:sz w:val="18"/>
+                <w:sz w:val="19"/>
               </w:rPr>
               <w:t>Superávit Físico Disponível</w:t>
             </w:r>
@@ -987,9 +987,9 @@
             <w:r/>
             <w:r>
               <w:rPr>
-                <w:rFonts w:ascii="Times New Roman" w:hAnsi="Times New Roman"/>
+                <w:rFonts w:ascii="Arial" w:hAnsi="Arial"/>
                 <w:b w:val="0"/>
-                <w:sz w:val="18"/>
+                <w:sz w:val="19"/>
               </w:rPr>
               <w:t>+53,76 hectares (141,35% da meta contratual)</w:t>
             </w:r>
@@ -1012,9 +1012,9 @@
             <w:r/>
             <w:r>
               <w:rPr>
-                <w:rFonts w:ascii="Times New Roman" w:hAnsi="Times New Roman"/>
+                <w:rFonts w:ascii="Arial" w:hAnsi="Arial"/>
                 <w:b/>
-                <w:sz w:val="18"/>
+                <w:sz w:val="19"/>
               </w:rPr>
               <w:t>Número de Polígonos Selecionados</w:t>
             </w:r>
@@ -1035,9 +1035,9 @@
             <w:r/>
             <w:r>
               <w:rPr>
-                <w:rFonts w:ascii="Times New Roman" w:hAnsi="Times New Roman"/>
+                <w:rFonts w:ascii="Arial" w:hAnsi="Arial"/>
                 <w:b w:val="0"/>
-                <w:sz w:val="18"/>
+                <w:sz w:val="19"/>
               </w:rPr>
               <w:t>2 glebas contíguas (menor número possível de fragmentos)</w:t>
             </w:r>
@@ -1060,9 +1060,9 @@
             <w:r/>
             <w:r>
               <w:rPr>
-                <w:rFonts w:ascii="Times New Roman" w:hAnsi="Times New Roman"/>
+                <w:rFonts w:ascii="Arial" w:hAnsi="Arial"/>
                 <w:b/>
-                <w:sz w:val="18"/>
+                <w:sz w:val="19"/>
               </w:rPr>
               <w:t>Classe Espectral Oficial (INPE)</w:t>
             </w:r>
@@ -1083,9 +1083,9 @@
             <w:r/>
             <w:r>
               <w:rPr>
-                <w:rFonts w:ascii="Times New Roman" w:hAnsi="Times New Roman"/>
+                <w:rFonts w:ascii="Arial" w:hAnsi="Arial"/>
                 <w:b w:val="0"/>
-                <w:sz w:val="18"/>
+                <w:sz w:val="19"/>
               </w:rPr>
               <w:t>DESMATAMENTO_CR (Corte Raso registrado em 20/07/2019)</w:t>
             </w:r>
@@ -1108,9 +1108,9 @@
             <w:r/>
             <w:r>
               <w:rPr>
-                <w:rFonts w:ascii="Times New Roman" w:hAnsi="Times New Roman"/>
+                <w:rFonts w:ascii="Arial" w:hAnsi="Arial"/>
                 <w:b/>
-                <w:sz w:val="18"/>
+                <w:sz w:val="19"/>
               </w:rPr>
               <w:t>Estágio Sucessional da Cobertura Vegetal</w:t>
             </w:r>
@@ -1131,9 +1131,9 @@
             <w:r/>
             <w:r>
               <w:rPr>
-                <w:rFonts w:ascii="Times New Roman" w:hAnsi="Times New Roman"/>
+                <w:rFonts w:ascii="Arial" w:hAnsi="Arial"/>
                 <w:b w:val="0"/>
-                <w:sz w:val="18"/>
+                <w:sz w:val="19"/>
               </w:rPr>
               <w:t>Regeneração Natural Secundária de Várzea (Dossel Fechado)</w:t>
             </w:r>
@@ -1143,7 +1143,7 @@
     </w:tbl>
     <w:p>
       <w:pPr>
-        <w:spacing w:after="80" w:line="276" w:lineRule="auto"/>
+        <w:spacing w:after="120" w:line="276" w:lineRule="auto"/>
         <w:jc w:val="left"/>
         <w:rPr>
           <w:rFonts w:ascii="Arial" w:hAnsi="Arial" w:cs="Arial"/>
@@ -1152,24 +1152,24 @@
       <w:r/>
       <w:r>
         <w:rPr>
-          <w:rFonts w:ascii="Times New Roman" w:hAnsi="Times New Roman"/>
+          <w:rFonts w:ascii="Arial" w:hAnsi="Arial"/>
           <w:b/>
-          <w:sz w:val="22"/>
+          <w:sz w:val="24"/>
         </w:rPr>
         <w:t>6. Conclusão e Encaminhamento</w:t>
       </w:r>
     </w:p>
     <w:p>
       <w:pPr>
-        <w:spacing w:after="280" w:line="276" w:lineRule="auto"/>
-        <w:jc w:val="left"/>
+        <w:spacing w:after="360" w:line="360" w:lineRule="auto"/>
+        <w:jc w:val="both"/>
       </w:pPr>
       <w:r/>
       <w:r>
         <w:rPr>
-          <w:rFonts w:ascii="Times New Roman" w:hAnsi="Times New Roman"/>
+          <w:rFonts w:ascii="Arial" w:hAnsi="Arial"/>
           <w:b w:val="0"/>
-          <w:sz w:val="22"/>
+          <w:sz w:val="24"/>
         </w:rPr>
         <w:t>Diante do exposto, considera-se a demanda do Memorando nº 04/ASSTEC e do Despacho DGMUC integralmente atendida no âmbito deste Núcleo de Geotecnologias. Juntam-se aos autos a prancha cartográfica oficial padronizada em anexo (formato A4 Paisagem em alta resolução de 300 DPI e PDF vetorial) e disponibilizam-se os arquivos geoespaciais em formato GeoPackage e Shapefile para subsidiar a elaboração dos projetos executivos da DGMUC.</w:t>
       </w:r>
@@ -1182,9 +1182,9 @@
       <w:r/>
       <w:r>
         <w:rPr>
-          <w:rFonts w:ascii="Times New Roman" w:hAnsi="Times New Roman"/>
+          <w:rFonts w:ascii="Arial" w:hAnsi="Arial"/>
           <w:b/>
-          <w:sz w:val="22"/>
+          <w:sz w:val="24"/>
         </w:rPr>
         <w:t>SAMUEL DA COSTA DOS SANTOS</w:t>
       </w:r>
@@ -1197,9 +1197,9 @@
       <w:r/>
       <w:r>
         <w:rPr>
-          <w:rFonts w:ascii="Times New Roman" w:hAnsi="Times New Roman"/>
+          <w:rFonts w:ascii="Arial" w:hAnsi="Arial"/>
           <w:b w:val="0"/>
-          <w:sz w:val="20"/>
+          <w:sz w:val="22"/>
         </w:rPr>
         <w:t>Coordenador do Núcleo de Geotecnologias – NGEO</w:t>
       </w:r>
@@ -1212,9 +1212,9 @@
       <w:r/>
       <w:r>
         <w:rPr>
-          <w:rFonts w:ascii="Times New Roman" w:hAnsi="Times New Roman"/>
+          <w:rFonts w:ascii="Arial" w:hAnsi="Arial"/>
           <w:b w:val="0"/>
-          <w:sz w:val="20"/>
+          <w:sz w:val="22"/>
         </w:rPr>
         <w:t>Instituto de Desenvolvimento Florestal e da Biodiversidade do Estado do Pará – IDEFLOR-Bio</w:t>
       </w:r>

</xml_diff>

<commit_message>
refactor(report): adequar tom institucional de subsidio, atribuicao oficial DETER, remessa por email e referencias ABNT
</commit_message>
<xml_diff>
--- a/outputs/relatorios/relatorio_tecnico_processo_2026_3611213.docx
+++ b/outputs/relatorios/relatorio_tecnico_processo_2026_3611213.docx
@@ -35,7 +35,7 @@
           <w:b/>
           <w:sz w:val="24"/>
         </w:rPr>
-        <w:t>Relatório Técnico de Diagnóstico Geoespacial de Desmatamento e Mapeamento de Áreas para Unidades Demonstrativas de Restauração Florestal no Parque Estadual Charapucu</w:t>
+        <w:t>Relatório Técnico de Diagnóstico Geoespacial de Desmatamento e Delimitação de Áreas no Parque Estadual Charapucu</w:t>
       </w:r>
     </w:p>
     <w:p>
@@ -162,7 +162,7 @@
           <w:b w:val="0"/>
           <w:sz w:val="24"/>
         </w:rPr>
-        <w:t>O presente relatório técnico tem por finalidade apresentar o levantamento geoespacial e a prancha cartográfica oficial elaborados pelo Núcleo de Geotecnologias (NGEO/IDEFLOR-Bio) em atendimento aos autos do Processo nº 2026/3611213. O objetivo central é a identificação, qualificação e delimitação espacial de polígonos representativos de supressão antrópica e desmatamento no interior do Parque Estadual Charapucu, atendendo à demanda de seleção de áreas que totalizem, no mínimo, 130 hectares distribuídos no menor número possível de polígonos contíguos, com vistas a subsidiar a implantação de Unidades Demonstrativas de Restauração Florestal em consonância com as diretrizes do Plano de Recuperação da Vegetação Nativa do Estado do Pará (PRVN-PA).</w:t>
+        <w:t>O presente relatório técnico visa a subsidiar a Diretoria de Gestão e Monitoramento de Unidades de Conservação (DGMUC) com o levantamento geoespacial e a prancha cartográfica institucional padronizada referentes às áreas de desmatamento no interior do Parque Estadual Charapucu, em atendimento aos autos do Processo nº 2026/3611213. O trabalho delimita e quantifica os polígonos representativos de supressão antrópica mapeados pelos sistemas oficiais de monitoramento, fornecendo os subsídios territoriais e cartográficos necessários para apoiar as decisões de planejamento da DGMUC.</w:t>
       </w:r>
     </w:p>
     <w:p>
@@ -199,7 +199,7 @@
           <w:b w:val="0"/>
           <w:sz w:val="24"/>
         </w:rPr>
-        <w:t>Por intermédio do Memorando nº 04/ASSTEC (Doc. Sequencial 01), subscrito pelo assessor Dilson Lopes, e corroborado pelo Despacho exarado pelo Diretor Ellivelton de Carvalho da Cunha (Doc. Sequencial 02), a Diretoria de Gestão e Monitoramento de Unidades de Conservação (DGMUC) encaminhou solicitação de apoio técnico ao NGEO para subsidiar projeto de restauração florestal no Parque Estadual Charapucu. Criado pelo Decreto Estadual nº 2.592, de 09 de novembro de 2010, no município de Afuá (Arquipélago do Marajó), o Parque Estadual Charapucu constitui uma Unidade de Conservação de Proteção Integral circunscrita por ecossistemas de várzea estuarina. Em face da dinâmica peculiar de marés e da elevada taxa de regeneração biológica da região, o diagnóstico espacial exigiu a diferenciação rigorosa entre feições sedimentares temporárias e áreas de efetiva alteração antrópica, fornecendo uma base auditada e segura para aplicação dos critérios técnicos do PRVN-PA.</w:t>
+        <w:t>A demanda foi encaminhada a este Núcleo de Geotecnologias por meio do Memorando nº 04/ASSTEC (Doc. Sequencial 01) e do Despacho autorizativo da DGMUC (Doc. Sequencial 02), solicitando a identificação de áreas que totalizassem no mínimo 130 hectares, priorizando a menor fragmentação possível em polígonos contíguos no Parque Estadual Charapucu. A referida Unidade de Conservação, criada pelo Decreto Estadual nº 2.592, de 09 de novembro de 2010, localiza-se no município de Afuá (Arquipélago do Marajó) e é caracterizada por florestas de várzea estuarina sob forte influência do regime de marés. Esse ambiente impõe a necessidade de rigor técnico na distinção entre variações hidrológicas sazonais e áreas com histórico consolidado de intervenção antrópica.</w:t>
       </w:r>
     </w:p>
     <w:p>
@@ -236,7 +236,7 @@
           <w:b w:val="0"/>
           <w:sz w:val="24"/>
         </w:rPr>
-        <w:t>A análise foi realizada em ambiente de Sistema de Informações Geográficas (SIG) sob o Sistema Geodésico de Referência SIRGAS 2000, com projeção plana UTM Fuso 22N (EPSG:31988) para todos os cálculos métricos de área e distância euclidiana. Os procedimentos envolveram: a) importação do limite oficial do PES Charapucu homologado no acervo do IDEFLOR-Bio; b) consulta e extração dos dados históricos do Sistema de Detecção do Desmatamento em Tempo Real (DETER / INPE / TerraBrasilis), identificando alertas oficiais de corte raso (DESMATAMENTO_CR); c) eliminação topológica de cursos d'água, furos e áreas sob interferência direta de maré; d) validação do estágio sucessional secundário da cobertura vegetal por meio do mosaico Sentinel-2 Cloudless EOX (10 m); e e) geração de prancha cartográfica institucional padronizada (A4 Paisagem, 300 DPI e PDF vetorial) conforme as normas técnicas do QGIS/NGEO.</w:t>
+        <w:t>Os procedimentos foram conduzidos em ambiente de Sistema de Informações Geográficas (SIG), utilizando o Sistema Geodésico SIRGAS 2000 em projeção plana UTM Fuso 22N (EPSG:31988) para a precisão das medições de área e distâncias. Foram integrados o limite oficial homologado do Parque Estadual Charapucu e a base de dados do Sistema de Detecção do Desmatamento em Tempo Real (DETER), mantido pelo Instituto Nacional de Pesquisas Espaciais (INPE). Realizou-se a conferência visual e espacial da cobertura vegetal por meio de imagens orbitais do sensor Sentinel-2, assegurando a consistência das feições terrestres em relação à hidrografia e canais de maré, culminando na geração de prancha cartográfica institucional padronizada.</w:t>
       </w:r>
     </w:p>
     <w:p>
@@ -272,7 +272,7 @@
           <w:b w:val="0"/>
           <w:sz w:val="24"/>
         </w:rPr>
-        <w:t>A auditoria geoespacial identificou que a área oficial de corte raso no PES Charapucu está concentrada no Setor Centro-Leste (bacia da Baía de Vieira Grande), decorrente de evento detectado em 20/07/2019. A área é formada por dois polígonos contíguos que totalizam 183,76 hectares, atendendo plenamente à exigência de menor fragmentação possível e superando a meta contratual mínima de 130 hectares em 141,35% (+53,76 ha de superávit).</w:t>
+        <w:t>A auditoria geoespacial confirmou a presença de duas ocorrências oficiais contíguas de corte raso (classe DESMATAMENTO_CR) registradas no interior da Unidade de Conservação em 20/07/2019, situadas no Setor Leste da ilha. As duas áreas somam 183,76 hectares, atendendo ao parâmetro de contiguidade e superando a demanda dimensional mínima de 130 hectares em 53,76 hectares.</w:t>
       </w:r>
     </w:p>
     <w:p>
@@ -290,7 +290,7 @@
           <w:b/>
           <w:sz w:val="24"/>
         </w:rPr>
-        <w:t>5.1 Detalhamento das Glebas Auditadas para Unidades Demonstrativas</w:t>
+        <w:t>5.1 Síntese Espacial das Glebas Mapeadas</w:t>
       </w:r>
     </w:p>
     <w:p>
@@ -308,7 +308,7 @@
           <w:b w:val="0"/>
           <w:sz w:val="24"/>
         </w:rPr>
-        <w:t>As glebas selecionadas para compor a carteira de áreas prioritárias para restauração florestal são descritas a seguir:</w:t>
+        <w:t>A distribuição espacial e a área calculada para cada polígono contíguo identificado no levantamento são sintetizadas na Tabela 1:</w:t>
       </w:r>
     </w:p>
     <w:tbl>
@@ -342,7 +342,7 @@
                 <w:b/>
                 <w:sz w:val="20"/>
               </w:rPr>
-              <w:t>Identificador da Gleba</w:t>
+              <w:t>Identificador NGEO</w:t>
             </w:r>
           </w:p>
         </w:tc>
@@ -365,7 +365,7 @@
                 <w:b/>
                 <w:sz w:val="20"/>
               </w:rPr>
-              <w:t>Área Auditada (ha)</w:t>
+              <w:t>Área Calculada (ha)</w:t>
             </w:r>
           </w:p>
         </w:tc>
@@ -388,7 +388,7 @@
                 <w:b/>
                 <w:sz w:val="20"/>
               </w:rPr>
-              <w:t>Localização &amp; Acessibilidade Fluvial</w:t>
+              <w:t>Localização e Acesso Fluvial</w:t>
             </w:r>
           </w:p>
         </w:tc>
@@ -413,7 +413,7 @@
                 <w:b w:val="0"/>
                 <w:sz w:val="19"/>
               </w:rPr>
-              <w:t>GLEBA-DETER-01 (ID INPE: 52664_hist)</w:t>
+              <w:t>Gleba 01 (Alerta INPE 52664_hist)</w:t>
             </w:r>
           </w:p>
         </w:tc>
@@ -459,7 +459,7 @@
                 <w:b w:val="0"/>
                 <w:sz w:val="19"/>
               </w:rPr>
-              <w:t>Setor Leste / Baía de Vieira Grande (2.298 m da calha)</w:t>
+              <w:t>Setor Leste (a 2.298 m da calha da Baía de Vieira Grande)</w:t>
             </w:r>
           </w:p>
         </w:tc>
@@ -484,7 +484,7 @@
                 <w:b w:val="0"/>
                 <w:sz w:val="19"/>
               </w:rPr>
-              <w:t>GLEBA-DETER-02 (ID INPE: 52663_hist)</w:t>
+              <w:t>Gleba 02 (Alerta INPE 52663_hist)</w:t>
             </w:r>
           </w:p>
         </w:tc>
@@ -530,7 +530,7 @@
                 <w:b w:val="0"/>
                 <w:sz w:val="19"/>
               </w:rPr>
-              <w:t>Setor Leste / Baía de Vieira Grande (3.214 m da calha)</w:t>
+              <w:t>Setor Leste (a 3.214 m da calha da Baía de Vieira Grande)</w:t>
             </w:r>
           </w:p>
         </w:tc>
@@ -551,7 +551,7 @@
           <w:b/>
           <w:sz w:val="24"/>
         </w:rPr>
-        <w:t>5.2 Enquadramento Geral e Critérios do PRVN-PA</w:t>
+        <w:t>5.2 Atributos Oficiais dos Alertas no Banco DETER / INPE</w:t>
       </w:r>
     </w:p>
     <w:tbl>
@@ -584,7 +584,7 @@
                 <w:b/>
                 <w:sz w:val="20"/>
               </w:rPr>
-              <w:t>Parâmetro do Projeto / Demanda</w:t>
+              <w:t>Atributo Oficial (DETER / TerraBrasilis)</w:t>
             </w:r>
           </w:p>
         </w:tc>
@@ -607,7 +607,7 @@
                 <w:b/>
                 <w:sz w:val="20"/>
               </w:rPr>
-              <w:t>Especificação Auditada (Processo nº 2026/3611213)</w:t>
+              <w:t>Especificação Técnica Homologada</w:t>
             </w:r>
           </w:p>
         </w:tc>
@@ -632,7 +632,7 @@
                 <w:b/>
                 <w:sz w:val="19"/>
               </w:rPr>
-              <w:t>Unidade de Conservação</w:t>
+              <w:t>Identificadores Oficiais no Banco (GID)</w:t>
             </w:r>
           </w:p>
         </w:tc>
@@ -655,7 +655,7 @@
                 <w:b w:val="0"/>
                 <w:sz w:val="19"/>
               </w:rPr>
-              <w:t>Parque Estadual Charapucu (PES Charapucu)</w:t>
+              <w:t>52664_hist e 52663_hist</w:t>
             </w:r>
           </w:p>
         </w:tc>
@@ -680,7 +680,7 @@
                 <w:b/>
                 <w:sz w:val="19"/>
               </w:rPr>
-              <w:t>Ato Legal de Criação</w:t>
+              <w:t>Classe de Desflorestamento Oficial</w:t>
             </w:r>
           </w:p>
         </w:tc>
@@ -703,7 +703,7 @@
                 <w:b w:val="0"/>
                 <w:sz w:val="19"/>
               </w:rPr>
-              <w:t>Decreto Estadual nº 2.592, de 09 de novembro de 2010</w:t>
+              <w:t>DESMATAMENTO_CR (Desmatamento por Corte Raso)</w:t>
             </w:r>
           </w:p>
         </w:tc>
@@ -728,7 +728,7 @@
                 <w:b/>
                 <w:sz w:val="19"/>
               </w:rPr>
-              <w:t>Categoria de Manejo</w:t>
+              <w:t>Data Oficial de Detecção</w:t>
             </w:r>
           </w:p>
         </w:tc>
@@ -751,7 +751,7 @@
                 <w:b w:val="0"/>
                 <w:sz w:val="19"/>
               </w:rPr>
-              <w:t>Proteção Integral (SNUC / Lei nº 9.985/2000; SEUC / Lei nº 5.977/1996)</w:t>
+              <w:t>20/07/2019</w:t>
             </w:r>
           </w:p>
         </w:tc>
@@ -776,7 +776,7 @@
                 <w:b/>
                 <w:sz w:val="19"/>
               </w:rPr>
-              <w:t>Município / Região de Integração</w:t>
+              <w:t>Satélite / Sensor Empregado</w:t>
             </w:r>
           </w:p>
         </w:tc>
@@ -799,7 +799,7 @@
                 <w:b w:val="0"/>
                 <w:sz w:val="19"/>
               </w:rPr>
-              <w:t>Afuá / Região de Integração do Marajó</w:t>
+              <w:t>CBERS-4 / AWFI (Resolução 64 metros)</w:t>
             </w:r>
           </w:p>
         </w:tc>
@@ -824,7 +824,7 @@
                 <w:b/>
                 <w:sz w:val="19"/>
               </w:rPr>
-              <w:t>Finalidade Institucional</w:t>
+              <w:t>Órbita / Ponto de Referência</w:t>
             </w:r>
           </w:p>
         </w:tc>
@@ -847,7 +847,7 @@
                 <w:b w:val="0"/>
                 <w:sz w:val="19"/>
               </w:rPr>
-              <w:t>Unidades Demonstrativas de Restauração Florestal (PRVN-PA)</w:t>
+              <w:t>168 / 099</w:t>
             </w:r>
           </w:p>
         </w:tc>
@@ -872,7 +872,7 @@
                 <w:b/>
                 <w:sz w:val="19"/>
               </w:rPr>
-              <w:t>Meta Contratual Mínima</w:t>
+              <w:t>Área Total Auditada em Projeção UTM</w:t>
             </w:r>
           </w:p>
         </w:tc>
@@ -895,7 +895,7 @@
                 <w:b w:val="0"/>
                 <w:sz w:val="19"/>
               </w:rPr>
-              <w:t>130,00 hectares</w:t>
+              <w:t>183,76 hectares (173,28 ha + 10,48 ha)</w:t>
             </w:r>
           </w:p>
         </w:tc>
@@ -920,7 +920,7 @@
                 <w:b/>
                 <w:sz w:val="19"/>
               </w:rPr>
-              <w:t>Área Total Mapeada e Auditada</w:t>
+              <w:t>Coordenadas Centróide - Gleba 01</w:t>
             </w:r>
           </w:p>
         </w:tc>
@@ -943,7 +943,7 @@
                 <w:b w:val="0"/>
                 <w:sz w:val="19"/>
               </w:rPr>
-              <w:t>183,76 hectares</w:t>
+              <w:t>Latitude: -0,39602° / Longitude: -50,39459°</w:t>
             </w:r>
           </w:p>
         </w:tc>
@@ -968,7 +968,7 @@
                 <w:b/>
                 <w:sz w:val="19"/>
               </w:rPr>
-              <w:t>Superávit Físico Disponível</w:t>
+              <w:t>Coordenadas Centróide - Gleba 02</w:t>
             </w:r>
           </w:p>
         </w:tc>
@@ -991,7 +991,7 @@
                 <w:b w:val="0"/>
                 <w:sz w:val="19"/>
               </w:rPr>
-              <w:t>+53,76 hectares (141,35% da meta contratual)</w:t>
+              <w:t>Latitude: -0,38486° / Longitude: -50,40265°</w:t>
             </w:r>
           </w:p>
         </w:tc>
@@ -1016,7 +1016,7 @@
                 <w:b/>
                 <w:sz w:val="19"/>
               </w:rPr>
-              <w:t>Número de Polígonos Selecionados</w:t>
+              <w:t>Sistema Geodésico de Medição</w:t>
             </w:r>
           </w:p>
         </w:tc>
@@ -1039,7 +1039,7 @@
                 <w:b w:val="0"/>
                 <w:sz w:val="19"/>
               </w:rPr>
-              <w:t>2 glebas contíguas (menor número possível de fragmentos)</w:t>
+              <w:t>SIRGAS 2000 / UTM zone 22N (EPSG:31988)</w:t>
             </w:r>
           </w:p>
         </w:tc>
@@ -1064,7 +1064,7 @@
                 <w:b/>
                 <w:sz w:val="19"/>
               </w:rPr>
-              <w:t>Classe Espectral Oficial (INPE)</w:t>
+              <w:t>Município / Estado</w:t>
             </w:r>
           </w:p>
         </w:tc>
@@ -1087,7 +1087,7 @@
                 <w:b w:val="0"/>
                 <w:sz w:val="19"/>
               </w:rPr>
-              <w:t>DESMATAMENTO_CR (Corte Raso registrado em 20/07/2019)</w:t>
+              <w:t>Afuá / Pará (Código IBGE: 1500305)</w:t>
             </w:r>
           </w:p>
         </w:tc>
@@ -1112,7 +1112,7 @@
                 <w:b/>
                 <w:sz w:val="19"/>
               </w:rPr>
-              <w:t>Estágio Sucessional da Cobertura Vegetal</w:t>
+              <w:t>Unidade de Conservação Incidente</w:t>
             </w:r>
           </w:p>
         </w:tc>
@@ -1135,7 +1135,7 @@
                 <w:b w:val="0"/>
                 <w:sz w:val="19"/>
               </w:rPr>
-              <w:t>Regeneração Natural Secundária de Várzea (Dossel Fechado)</w:t>
+              <w:t>Parque Estadual Charapucu (Decreto Estadual nº 2.592/2010)</w:t>
             </w:r>
           </w:p>
         </w:tc>
@@ -1161,7 +1161,7 @@
     </w:p>
     <w:p>
       <w:pPr>
-        <w:spacing w:after="360" w:line="360" w:lineRule="auto"/>
+        <w:spacing w:after="280" w:line="360" w:lineRule="auto"/>
         <w:jc w:val="both"/>
       </w:pPr>
       <w:r/>
@@ -1171,7 +1171,111 @@
           <w:b w:val="0"/>
           <w:sz w:val="24"/>
         </w:rPr>
-        <w:t>Diante do exposto, considera-se a demanda do Memorando nº 04/ASSTEC e do Despacho DGMUC integralmente atendida no âmbito deste Núcleo de Geotecnologias. Juntam-se aos autos a prancha cartográfica oficial padronizada em anexo (formato A4 Paisagem em alta resolução de 300 DPI e PDF vetorial) e disponibilizam-se os arquivos geoespaciais em formato GeoPackage e Shapefile para subsidiar a elaboração dos projetos executivos da DGMUC.</w:t>
+        <w:t>Com os resultados apresentados, este Núcleo de Geotecnologias considera atendida a solicitação de subsídios formulada pela DGMUC. Informa-se que a prancha cartográfica oficial padronizada segue anexa a este relatório em formato digital (PDF), enquanto os arquivos vetoriais geoespaciais correspondentes (Shapefile e GeoPackage) serão disponibilizados por meio de mensagem eletrônica institucional (e-mail), em conformidade com as características operacionais do sistema de tramitação de processos.</w:t>
+      </w:r>
+    </w:p>
+    <w:p>
+      <w:pPr>
+        <w:spacing w:after="120" w:line="276" w:lineRule="auto"/>
+        <w:jc w:val="left"/>
+      </w:pPr>
+      <w:r/>
+      <w:r>
+        <w:rPr>
+          <w:rFonts w:ascii="Arial" w:hAnsi="Arial"/>
+          <w:b/>
+          <w:sz w:val="24"/>
+        </w:rPr>
+        <w:t>7. Referências</w:t>
+      </w:r>
+    </w:p>
+    <w:p>
+      <w:pPr>
+        <w:spacing w:after="80" w:line="276" w:lineRule="auto"/>
+        <w:jc w:val="both"/>
+      </w:pPr>
+      <w:r/>
+      <w:r>
+        <w:rPr>
+          <w:rFonts w:ascii="Arial" w:hAnsi="Arial"/>
+          <w:b w:val="0"/>
+          <w:sz w:val="20"/>
+        </w:rPr>
+        <w:t>BRASIL. Instituto Nacional de Pesquisas Espaciais (INPE). Sistema de Detecção do Desmatamento em Tempo Real (DETER): Amazônia Legal. Plataforma TerraBrasilis, 2019-2026. Disponível em: &lt;http://terrabrasilis.dpi.inpe.br&gt;. Acesso em: 28 out. 2026.</w:t>
+      </w:r>
+    </w:p>
+    <w:p>
+      <w:pPr>
+        <w:spacing w:after="80" w:line="276" w:lineRule="auto"/>
+        <w:jc w:val="both"/>
+      </w:pPr>
+      <w:r/>
+      <w:r>
+        <w:rPr>
+          <w:rFonts w:ascii="Arial" w:hAnsi="Arial"/>
+          <w:b w:val="0"/>
+          <w:sz w:val="20"/>
+        </w:rPr>
+        <w:t>EOX IT Services GmbH. Sentinel-2 cloudless layer. Viena: EOX, 2025. Disponível em: &lt;https://tiles.maps.eox.at&gt;. Acesso em: 28 out. 2026.</w:t>
+      </w:r>
+    </w:p>
+    <w:p>
+      <w:pPr>
+        <w:spacing w:after="80" w:line="276" w:lineRule="auto"/>
+        <w:jc w:val="both"/>
+      </w:pPr>
+      <w:r/>
+      <w:r>
+        <w:rPr>
+          <w:rFonts w:ascii="Arial" w:hAnsi="Arial"/>
+          <w:b w:val="0"/>
+          <w:sz w:val="20"/>
+        </w:rPr>
+        <w:t>EUROPEAN SPACE AGENCY (ESA). Copernicus Sentinel-2 MSI data. Paris: ESA, 2025. Disponível em: &lt;https://sentinels.copernicus.eu&gt;. Acesso em: 28 out. 2026.</w:t>
+      </w:r>
+    </w:p>
+    <w:p>
+      <w:pPr>
+        <w:spacing w:after="80" w:line="276" w:lineRule="auto"/>
+        <w:jc w:val="both"/>
+      </w:pPr>
+      <w:r/>
+      <w:r>
+        <w:rPr>
+          <w:rFonts w:ascii="Arial" w:hAnsi="Arial"/>
+          <w:b w:val="0"/>
+          <w:sz w:val="20"/>
+        </w:rPr>
+        <w:t>IBGE - Instituto Brasileiro de Geografia e Estatística. Sistema de Referência Geocêntrico para as Américas (SIRGAS 2000). Rio de Janeiro: IBGE, 2026.</w:t>
+      </w:r>
+    </w:p>
+    <w:p>
+      <w:pPr>
+        <w:spacing w:after="80" w:line="276" w:lineRule="auto"/>
+        <w:jc w:val="both"/>
+      </w:pPr>
+      <w:r/>
+      <w:r>
+        <w:rPr>
+          <w:rFonts w:ascii="Arial" w:hAnsi="Arial"/>
+          <w:b w:val="0"/>
+          <w:sz w:val="20"/>
+        </w:rPr>
+        <w:t>PARÁ (Estado). Decreto Estadual nº 2.592, de 09 de novembro de 2010. Cria o Parque Estadual Charapucu, no município de Afuá, e dá outras providências. Diário Oficial do Estado do Pará, Belém, 10 nov. 2010.</w:t>
+      </w:r>
+    </w:p>
+    <w:p>
+      <w:pPr>
+        <w:spacing w:after="200" w:line="360" w:lineRule="auto"/>
+        <w:jc w:val="both"/>
+      </w:pPr>
+      <w:r/>
+      <w:r>
+        <w:rPr>
+          <w:rFonts w:ascii="Arial" w:hAnsi="Arial"/>
+          <w:b w:val="0"/>
+          <w:sz w:val="24"/>
+        </w:rPr>
       </w:r>
     </w:p>
     <w:p>

</xml_diff>